<commit_message>
Inserta las capturas reales en el informe de despliegue
El informe tenia recuadros marcando donde iban las imagenes; ahora lleva
incrustadas las seis capturas que se tomaron durante el despliegue: el panel
con la cuenta creada, los archivos ya cargados en htdocs, los datos de
conexion de MySQL, y los tres errores que aparecieron (el RAR rechazado, la
carga fuera de htdocs y el DROP DATABASE desactivado).

Quedan dos recuadros pendientes, los de phpMyAdmin con las tablas y el sitio
publicado, que se toman al terminar el despliegue. Las figuras se renumeraron
a 11 para que las nuevas entren en orden.

A la captura del panel se le recorto la publicidad de los costados, y la de
los datos de FTP se dejo fuera: mostraba la contrasena en texto plano.
</commit_message>
<xml_diff>
--- a/docs/Informe-despliegue-GitHub-hosting.docx
+++ b/docs/Informe-despliegue-GitHub-hosting.docx
@@ -1635,6 +1635,327 @@
     </w:p>
     <w:p>
       <w:pPr>
+        <w:spacing w:after="80" w:before="140"/>
+        <w:jc w:val="center"/>
+      </w:pPr>
+      <w:r>
+        <w:drawing>
+          <wp:inline distT="0" distB="0" distL="0" distR="0">
+            <wp:extent cx="5715000" cy="3429000"/>
+            <wp:effectExtent t="0" r="0" b="0" l="0"/>
+            <wp:docPr id="1" name="" descr="" title=""/>
+            <wp:cNvGraphicFramePr>
+              <a:graphicFrameLocks xmlns:a="http://schemas.openxmlformats.org/drawingml/2006/main" noChangeAspect="1"/>
+            </wp:cNvGraphicFramePr>
+            <a:graphic xmlns:a="http://schemas.openxmlformats.org/drawingml/2006/main">
+              <a:graphicData uri="http://schemas.openxmlformats.org/drawingml/2006/picture">
+                <pic:pic xmlns:pic="http://schemas.openxmlformats.org/drawingml/2006/picture">
+                  <pic:nvPicPr>
+                    <pic:cNvPr id="0" name="" descr=""/>
+                    <pic:cNvPicPr>
+                      <a:picLocks noChangeAspect="1" noChangeArrowheads="1"/>
+                    </pic:cNvPicPr>
+                  </pic:nvPicPr>
+                  <pic:blipFill>
+                    <a:blip r:embed="rId7" cstate="none"/>
+                    <a:srcRect/>
+                    <a:stretch>
+                      <a:fillRect/>
+                    </a:stretch>
+                  </pic:blipFill>
+                  <pic:spPr bwMode="auto">
+                    <a:xfrm>
+                      <a:off x="0" y="0"/>
+                      <a:ext cx="5715000" cy="3429000"/>
+                    </a:xfrm>
+                    <a:prstGeom prst="rect">
+                      <a:avLst/>
+                    </a:prstGeom>
+                  </pic:spPr>
+                </pic:pic>
+              </a:graphicData>
+            </a:graphic>
+          </wp:inline>
+        </w:drawing>
+      </w:r>
+    </w:p>
+    <w:p>
+      <w:pPr>
+        <w:spacing w:after="240"/>
+        <w:jc w:val="center"/>
+      </w:pPr>
+      <w:r>
+        <w:rPr>
+          <w:rFonts w:ascii="Arial" w:cs="Arial" w:eastAsia="Arial" w:hAnsi="Arial"/>
+          <w:i/>
+          <w:iCs/>
+          <w:sz w:val="18"/>
+          <w:szCs w:val="18"/>
+        </w:rPr>
+        <w:t xml:space="preserve">Figura 3. Cuenta de alojamiento creada, con el subdominio ya asignado.</w:t>
+      </w:r>
+    </w:p>
+    <w:p>
+      <w:pPr>
+        <w:spacing w:after="160" w:line="300"/>
+        <w:jc w:val="both"/>
+      </w:pPr>
+      <w:r>
+        <w:rPr>
+          <w:rFonts w:ascii="Arial" w:cs="Arial" w:eastAsia="Arial" w:hAnsi="Arial"/>
+          <w:sz w:val="22"/>
+          <w:szCs w:val="22"/>
+        </w:rPr>
+        <w:t xml:space="preserve">El panel advierte que un dominio nuevo puede tardar hasta 72 horas en ser accesible desde todas las redes, debido al almacenamiento en caché del sistema de nombres de dominio. En mi caso la espera fue de pocos minutos, pero conviene tenerlo previsto y no confundir esa demora con un error del proyecto.</w:t>
+      </w:r>
+    </w:p>
+    <w:p>
+      <w:pPr>
+        <w:pStyle w:val="Heading2"/>
+        <w:spacing w:after="140" w:before="240"/>
+      </w:pPr>
+      <w:r>
+        <w:rPr>
+          <w:rFonts w:ascii="Arial" w:cs="Arial" w:eastAsia="Arial" w:hAnsi="Arial"/>
+          <w:b/>
+          <w:bCs/>
+          <w:color w:val="2E5496"/>
+          <w:sz w:val="24"/>
+          <w:szCs w:val="24"/>
+        </w:rPr>
+        <w:t xml:space="preserve">5.3 Subida de los archivos</w:t>
+      </w:r>
+    </w:p>
+    <w:p>
+      <w:pPr>
+        <w:spacing w:after="160" w:line="300"/>
+        <w:jc w:val="both"/>
+      </w:pPr>
+      <w:r>
+        <w:rPr>
+          <w:rFonts w:ascii="Arial" w:cs="Arial" w:eastAsia="Arial" w:hAnsi="Arial"/>
+          <w:sz w:val="22"/>
+          <w:szCs w:val="22"/>
+        </w:rPr>
+        <w:t xml:space="preserve">Descargué el proyecto desde GitHub en formato comprimido y lo subí mediante el gestor de archivos del panel. La carpeta pública del servidor se llama htdocs: todo lo que se coloca ahí queda accesible desde el navegador, y lo que quede fuera, no.</w:t>
+      </w:r>
+    </w:p>
+    <w:p>
+      <w:pPr>
+        <w:spacing w:after="80" w:before="140"/>
+        <w:jc w:val="center"/>
+      </w:pPr>
+      <w:r>
+        <w:drawing>
+          <wp:inline distT="0" distB="0" distL="0" distR="0">
+            <wp:extent cx="5334000" cy="2581275"/>
+            <wp:effectExtent t="0" r="0" b="0" l="0"/>
+            <wp:docPr id="1" name="" descr="" title=""/>
+            <wp:cNvGraphicFramePr>
+              <a:graphicFrameLocks xmlns:a="http://schemas.openxmlformats.org/drawingml/2006/main" noChangeAspect="1"/>
+            </wp:cNvGraphicFramePr>
+            <a:graphic xmlns:a="http://schemas.openxmlformats.org/drawingml/2006/main">
+              <a:graphicData uri="http://schemas.openxmlformats.org/drawingml/2006/picture">
+                <pic:pic xmlns:pic="http://schemas.openxmlformats.org/drawingml/2006/picture">
+                  <pic:nvPicPr>
+                    <pic:cNvPr id="0" name="" descr=""/>
+                    <pic:cNvPicPr>
+                      <a:picLocks noChangeAspect="1" noChangeArrowheads="1"/>
+                    </pic:cNvPicPr>
+                  </pic:nvPicPr>
+                  <pic:blipFill>
+                    <a:blip r:embed="rId8" cstate="none"/>
+                    <a:srcRect/>
+                    <a:stretch>
+                      <a:fillRect/>
+                    </a:stretch>
+                  </pic:blipFill>
+                  <pic:spPr bwMode="auto">
+                    <a:xfrm>
+                      <a:off x="0" y="0"/>
+                      <a:ext cx="5334000" cy="2581275"/>
+                    </a:xfrm>
+                    <a:prstGeom prst="rect">
+                      <a:avLst/>
+                    </a:prstGeom>
+                  </pic:spPr>
+                </pic:pic>
+              </a:graphicData>
+            </a:graphic>
+          </wp:inline>
+        </w:drawing>
+      </w:r>
+    </w:p>
+    <w:p>
+      <w:pPr>
+        <w:spacing w:after="240"/>
+        <w:jc w:val="center"/>
+      </w:pPr>
+      <w:r>
+        <w:rPr>
+          <w:rFonts w:ascii="Arial" w:cs="Arial" w:eastAsia="Arial" w:hAnsi="Arial"/>
+          <w:i/>
+          <w:iCs/>
+          <w:sz w:val="18"/>
+          <w:szCs w:val="18"/>
+        </w:rPr>
+        <w:t xml:space="preserve">Figura 4. Archivos del proyecto ya cargados dentro de la carpeta htdocs.</w:t>
+      </w:r>
+    </w:p>
+    <w:p>
+      <w:pPr>
+        <w:spacing w:after="160" w:line="300"/>
+        <w:jc w:val="both"/>
+      </w:pPr>
+      <w:r>
+        <w:rPr>
+          <w:rFonts w:ascii="Arial" w:cs="Arial" w:eastAsia="Arial" w:hAnsi="Arial"/>
+          <w:sz w:val="22"/>
+          <w:szCs w:val="22"/>
+        </w:rPr>
+        <w:t xml:space="preserve">Decidí no subir la carpeta que contiene los archivos .sql. La importación se hace desde phpMyAdmin seleccionando el archivo que está en mi propia computadora, así que subirlos al servidor no aporta nada y, en cambio, dejaría el volcado completo de la base al alcance de cualquiera que adivinara la dirección.</w:t>
+      </w:r>
+    </w:p>
+    <w:p>
+      <w:pPr>
+        <w:pStyle w:val="Heading2"/>
+        <w:spacing w:after="140" w:before="240"/>
+      </w:pPr>
+      <w:r>
+        <w:rPr>
+          <w:rFonts w:ascii="Arial" w:cs="Arial" w:eastAsia="Arial" w:hAnsi="Arial"/>
+          <w:b/>
+          <w:bCs/>
+          <w:color w:val="2E5496"/>
+          <w:sz w:val="24"/>
+          <w:szCs w:val="24"/>
+        </w:rPr>
+        <w:t xml:space="preserve">5.4 Creación de la base de datos</w:t>
+      </w:r>
+    </w:p>
+    <w:p>
+      <w:pPr>
+        <w:spacing w:after="160" w:line="300"/>
+        <w:jc w:val="both"/>
+      </w:pPr>
+      <w:r>
+        <w:rPr>
+          <w:rFonts w:ascii="Arial" w:cs="Arial" w:eastAsia="Arial" w:hAnsi="Arial"/>
+          <w:sz w:val="22"/>
+          <w:szCs w:val="22"/>
+        </w:rPr>
+        <w:t xml:space="preserve">Desde la sección de bases de datos del panel creé una base nueva. Aquí apareció el primer detalle propio del alojamiento compartido: el panel antepone el identificador de la cuenta al nombre que uno elige, de modo que la base que llamé "dyd" quedó registrada con el prefijo correspondiente. Lo mismo ocurre con el usuario.</w:t>
+      </w:r>
+    </w:p>
+    <w:p>
+      <w:pPr>
+        <w:spacing w:after="80" w:before="140"/>
+        <w:jc w:val="center"/>
+      </w:pPr>
+      <w:r>
+        <w:drawing>
+          <wp:inline distT="0" distB="0" distL="0" distR="0">
+            <wp:extent cx="5715000" cy="3590925"/>
+            <wp:effectExtent t="0" r="0" b="0" l="0"/>
+            <wp:docPr id="1" name="" descr="" title=""/>
+            <wp:cNvGraphicFramePr>
+              <a:graphicFrameLocks xmlns:a="http://schemas.openxmlformats.org/drawingml/2006/main" noChangeAspect="1"/>
+            </wp:cNvGraphicFramePr>
+            <a:graphic xmlns:a="http://schemas.openxmlformats.org/drawingml/2006/main">
+              <a:graphicData uri="http://schemas.openxmlformats.org/drawingml/2006/picture">
+                <pic:pic xmlns:pic="http://schemas.openxmlformats.org/drawingml/2006/picture">
+                  <pic:nvPicPr>
+                    <pic:cNvPr id="0" name="" descr=""/>
+                    <pic:cNvPicPr>
+                      <a:picLocks noChangeAspect="1" noChangeArrowheads="1"/>
+                    </pic:cNvPicPr>
+                  </pic:nvPicPr>
+                  <pic:blipFill>
+                    <a:blip r:embed="rId9" cstate="none"/>
+                    <a:srcRect/>
+                    <a:stretch>
+                      <a:fillRect/>
+                    </a:stretch>
+                  </pic:blipFill>
+                  <pic:spPr bwMode="auto">
+                    <a:xfrm>
+                      <a:off x="0" y="0"/>
+                      <a:ext cx="5715000" cy="3590925"/>
+                    </a:xfrm>
+                    <a:prstGeom prst="rect">
+                      <a:avLst/>
+                    </a:prstGeom>
+                  </pic:spPr>
+                </pic:pic>
+              </a:graphicData>
+            </a:graphic>
+          </wp:inline>
+        </w:drawing>
+      </w:r>
+    </w:p>
+    <w:p>
+      <w:pPr>
+        <w:spacing w:after="240"/>
+        <w:jc w:val="center"/>
+      </w:pPr>
+      <w:r>
+        <w:rPr>
+          <w:rFonts w:ascii="Arial" w:cs="Arial" w:eastAsia="Arial" w:hAnsi="Arial"/>
+          <w:i/>
+          <w:iCs/>
+          <w:sz w:val="18"/>
+          <w:szCs w:val="18"/>
+        </w:rPr>
+        <w:t xml:space="preserve">Figura 5. Datos de conexión entregados por el panel y base de datos creada.</w:t>
+      </w:r>
+    </w:p>
+    <w:p>
+      <w:pPr>
+        <w:spacing w:after="160" w:line="300"/>
+        <w:jc w:val="both"/>
+      </w:pPr>
+      <w:r>
+        <w:rPr>
+          <w:rFonts w:ascii="Arial" w:cs="Arial" w:eastAsia="Arial" w:hAnsi="Arial"/>
+          <w:sz w:val="22"/>
+          <w:szCs w:val="22"/>
+        </w:rPr>
+        <w:t xml:space="preserve">El panel muestra cuatro datos que hay que copiar tal como aparecen: nombre del servidor MySQL, nombre de la base, usuario y contraseña. Anotarlos con exactitud evita la mayor parte de los errores posteriores.</w:t>
+      </w:r>
+    </w:p>
+    <w:p>
+      <w:pPr>
+        <w:pStyle w:val="Heading2"/>
+        <w:spacing w:after="140" w:before="240"/>
+      </w:pPr>
+      <w:r>
+        <w:rPr>
+          <w:rFonts w:ascii="Arial" w:cs="Arial" w:eastAsia="Arial" w:hAnsi="Arial"/>
+          <w:b/>
+          <w:bCs/>
+          <w:color w:val="2E5496"/>
+          <w:sz w:val="24"/>
+          <w:szCs w:val="24"/>
+        </w:rPr>
+        <w:t xml:space="preserve">5.5 Importación de la estructura y los datos</w:t>
+      </w:r>
+    </w:p>
+    <w:p>
+      <w:pPr>
+        <w:spacing w:after="160" w:line="300"/>
+        <w:jc w:val="both"/>
+      </w:pPr>
+      <w:r>
+        <w:rPr>
+          <w:rFonts w:ascii="Arial" w:cs="Arial" w:eastAsia="Arial" w:hAnsi="Arial"/>
+          <w:sz w:val="22"/>
+          <w:szCs w:val="22"/>
+        </w:rPr>
+        <w:t xml:space="preserve">Abrí phpMyAdmin desde el panel, seleccioné la base recién creada y utilicé la pestaña de importación, primero con el archivo de estructura y luego con el de contenido. El orden importa: el segundo archivo inserta registros en tablas que solo existen después de ejecutar el primero.</w:t>
+      </w:r>
+    </w:p>
+    <w:p>
+      <w:pPr>
         <w:pBdr>
           <w:top w:val="dashed" w:color="9E9E9E" w:sz="6"/>
           <w:bottom w:val="dashed" w:color="9E9E9E" w:sz="6"/>
@@ -1665,7 +1986,7 @@
           <w:sz w:val="20"/>
           <w:szCs w:val="20"/>
         </w:rPr>
-        <w:t xml:space="preserve">  Panel de control de InfinityFree con la cuenta creada y el subdominio asignado.</w:t>
+        <w:t xml:space="preserve">  phpMyAdmin mostrando las tablas del proyecto ya creadas.</w:t>
       </w:r>
     </w:p>
     <w:p>
@@ -1681,21 +2002,7 @@
           <w:sz w:val="18"/>
           <w:szCs w:val="18"/>
         </w:rPr>
-        <w:t xml:space="preserve">Figura 3. Cuenta de alojamiento recién creada.</w:t>
-      </w:r>
-    </w:p>
-    <w:p>
-      <w:pPr>
-        <w:spacing w:after="160" w:line="300"/>
-        <w:jc w:val="both"/>
-      </w:pPr>
-      <w:r>
-        <w:rPr>
-          <w:rFonts w:ascii="Arial" w:cs="Arial" w:eastAsia="Arial" w:hAnsi="Arial"/>
-          <w:sz w:val="22"/>
-          <w:szCs w:val="22"/>
-        </w:rPr>
-        <w:t xml:space="preserve">El panel advierte que un dominio nuevo puede tardar hasta 72 horas en ser accesible desde todas las redes, debido al almacenamiento en caché del sistema de nombres de dominio. En mi caso la espera fue de pocos minutos, pero conviene tenerlo previsto y no confundir esa demora con un error del proyecto.</w:t>
+        <w:t xml:space="preserve">Figura 6. Base de datos migrada correctamente.</w:t>
       </w:r>
     </w:p>
     <w:p>
@@ -1712,7 +2019,7 @@
           <w:sz w:val="24"/>
           <w:szCs w:val="24"/>
         </w:rPr>
-        <w:t xml:space="preserve">5.3 Subida de los archivos</w:t>
+        <w:t xml:space="preserve">5.6 Configuración de la conexión</w:t>
       </w:r>
     </w:p>
     <w:p>
@@ -1726,7 +2033,157 @@
           <w:sz w:val="22"/>
           <w:szCs w:val="22"/>
         </w:rPr>
-        <w:t xml:space="preserve">Descargué el proyecto desde GitHub en formato comprimido y lo subí mediante el gestor de archivos del panel. La carpeta pública del servidor se llama htdocs: todo lo que se coloca ahí queda accesible desde el navegador, y lo que quede fuera, no.</w:t>
+        <w:t xml:space="preserve">Con la base ya cargada, faltaba indicarle a la aplicación dónde encontrarla. Creé en el servidor un archivo de configuración con los cuatro datos del panel, siguiendo esta estructura:</w:t>
+      </w:r>
+    </w:p>
+    <w:p>
+      <w:pPr>
+        <w:shd w:fill="F5F5F5" w:val="clear"/>
+        <w:spacing w:after="0" w:line="260"/>
+        <w:ind w:left="431"/>
+      </w:pPr>
+      <w:r>
+        <w:rPr>
+          <w:rFonts w:ascii="Consolas" w:cs="Consolas" w:eastAsia="Consolas" w:hAnsi="Consolas"/>
+          <w:sz w:val="19"/>
+          <w:szCs w:val="19"/>
+        </w:rPr>
+        <w:t xml:space="preserve">&lt;?php</w:t>
+      </w:r>
+    </w:p>
+    <w:p>
+      <w:pPr>
+        <w:shd w:fill="F5F5F5" w:val="clear"/>
+        <w:spacing w:after="0" w:line="260"/>
+        <w:ind w:left="431"/>
+      </w:pPr>
+      <w:r>
+        <w:rPr>
+          <w:rFonts w:ascii="Consolas" w:cs="Consolas" w:eastAsia="Consolas" w:hAnsi="Consolas"/>
+          <w:sz w:val="19"/>
+          <w:szCs w:val="19"/>
+        </w:rPr>
+        <w:t xml:space="preserve">return [</w:t>
+      </w:r>
+    </w:p>
+    <w:p>
+      <w:pPr>
+        <w:shd w:fill="F5F5F5" w:val="clear"/>
+        <w:spacing w:after="0" w:line="260"/>
+        <w:ind w:left="431"/>
+      </w:pPr>
+      <w:r>
+        <w:rPr>
+          <w:rFonts w:ascii="Consolas" w:cs="Consolas" w:eastAsia="Consolas" w:hAnsi="Consolas"/>
+          <w:sz w:val="19"/>
+          <w:szCs w:val="19"/>
+        </w:rPr>
+        <w:t xml:space="preserve">    'host'    =&gt; 'sqlXXX.infinityfree.com',</w:t>
+      </w:r>
+    </w:p>
+    <w:p>
+      <w:pPr>
+        <w:shd w:fill="F5F5F5" w:val="clear"/>
+        <w:spacing w:after="0" w:line="260"/>
+        <w:ind w:left="431"/>
+      </w:pPr>
+      <w:r>
+        <w:rPr>
+          <w:rFonts w:ascii="Consolas" w:cs="Consolas" w:eastAsia="Consolas" w:hAnsi="Consolas"/>
+          <w:sz w:val="19"/>
+          <w:szCs w:val="19"/>
+        </w:rPr>
+        <w:t xml:space="preserve">    'base'    =&gt; 'ifX_XXXXXXXX_dyd',</w:t>
+      </w:r>
+    </w:p>
+    <w:p>
+      <w:pPr>
+        <w:shd w:fill="F5F5F5" w:val="clear"/>
+        <w:spacing w:after="0" w:line="260"/>
+        <w:ind w:left="431"/>
+      </w:pPr>
+      <w:r>
+        <w:rPr>
+          <w:rFonts w:ascii="Consolas" w:cs="Consolas" w:eastAsia="Consolas" w:hAnsi="Consolas"/>
+          <w:sz w:val="19"/>
+          <w:szCs w:val="19"/>
+        </w:rPr>
+        <w:t xml:space="preserve">    'usuario' =&gt; 'ifX_XXXXXXXX',</w:t>
+      </w:r>
+    </w:p>
+    <w:p>
+      <w:pPr>
+        <w:shd w:fill="F5F5F5" w:val="clear"/>
+        <w:spacing w:after="0" w:line="260"/>
+        <w:ind w:left="431"/>
+      </w:pPr>
+      <w:r>
+        <w:rPr>
+          <w:rFonts w:ascii="Consolas" w:cs="Consolas" w:eastAsia="Consolas" w:hAnsi="Consolas"/>
+          <w:sz w:val="19"/>
+          <w:szCs w:val="19"/>
+        </w:rPr>
+        <w:t xml:space="preserve">    'clave'   =&gt; '**********',</w:t>
+      </w:r>
+    </w:p>
+    <w:p>
+      <w:pPr>
+        <w:shd w:fill="F5F5F5" w:val="clear"/>
+        <w:spacing w:after="200" w:line="260"/>
+        <w:ind w:left="431"/>
+      </w:pPr>
+      <w:r>
+        <w:rPr>
+          <w:rFonts w:ascii="Consolas" w:cs="Consolas" w:eastAsia="Consolas" w:hAnsi="Consolas"/>
+          <w:sz w:val="19"/>
+          <w:szCs w:val="19"/>
+        </w:rPr>
+        <w:t xml:space="preserve">];</w:t>
+      </w:r>
+    </w:p>
+    <w:p>
+      <w:pPr>
+        <w:spacing w:after="160" w:line="300"/>
+        <w:jc w:val="both"/>
+      </w:pPr>
+      <w:r>
+        <w:rPr>
+          <w:rFonts w:ascii="Arial" w:cs="Arial" w:eastAsia="Arial" w:hAnsi="Arial"/>
+          <w:sz w:val="22"/>
+          <w:szCs w:val="22"/>
+        </w:rPr>
+        <w:t xml:space="preserve">Este archivo vive únicamente en el servidor y está excluido del repositorio, por las razones que detallo en el apartado de buenas prácticas.</w:t>
+      </w:r>
+    </w:p>
+    <w:p>
+      <w:pPr>
+        <w:pStyle w:val="Heading2"/>
+        <w:spacing w:after="140" w:before="240"/>
+      </w:pPr>
+      <w:r>
+        <w:rPr>
+          <w:rFonts w:ascii="Arial" w:cs="Arial" w:eastAsia="Arial" w:hAnsi="Arial"/>
+          <w:b/>
+          <w:bCs/>
+          <w:color w:val="2E5496"/>
+          <w:sz w:val="24"/>
+          <w:szCs w:val="24"/>
+        </w:rPr>
+        <w:t xml:space="preserve">5.7 Verificación</w:t>
+      </w:r>
+    </w:p>
+    <w:p>
+      <w:pPr>
+        <w:spacing w:after="160" w:line="300"/>
+        <w:jc w:val="both"/>
+      </w:pPr>
+      <w:r>
+        <w:rPr>
+          <w:rFonts w:ascii="Arial" w:cs="Arial" w:eastAsia="Arial" w:hAnsi="Arial"/>
+          <w:sz w:val="22"/>
+          <w:szCs w:val="22"/>
+        </w:rPr>
+        <w:t xml:space="preserve">Con todo en su lugar abrí la dirección pública y comprobé el funcionamiento completo: la portada cargando los reportajes desde la base, la navegación entre secciones, el acceso al panel de administración y las operaciones de crear, editar y eliminar. Presté atención especial a que las tildes y las eñes se guardaran y se mostraran correctamente, porque la codificación de caracteres es uno de los puntos donde suelen aparecer fallas al cambiar de servidor.</w:t>
       </w:r>
     </w:p>
     <w:p>
@@ -1761,7 +2218,7 @@
           <w:sz w:val="20"/>
           <w:szCs w:val="20"/>
         </w:rPr>
-        <w:t xml:space="preserve">  Gestor de archivos mostrando el contenido del proyecto dentro de la carpeta htdocs.</w:t>
+        <w:t xml:space="preserve">  La portada del sitio abierta en el navegador, en la dirección pública.</w:t>
       </w:r>
     </w:p>
     <w:p>
@@ -1777,7 +2234,24 @@
           <w:sz w:val="18"/>
           <w:szCs w:val="18"/>
         </w:rPr>
-        <w:t xml:space="preserve">Figura 4. Archivos del proyecto ya cargados en el servidor.</w:t>
+        <w:t xml:space="preserve">Figura 7. Aplicación publicada y operativa.</w:t>
+      </w:r>
+    </w:p>
+    <w:p>
+      <w:pPr>
+        <w:pStyle w:val="Heading1"/>
+        <w:spacing w:after="180" w:before="320"/>
+      </w:pPr>
+      <w:r>
+        <w:rPr>
+          <w:rFonts w:ascii="Arial" w:cs="Arial" w:eastAsia="Arial" w:hAnsi="Arial"/>
+          <w:b/>
+          <w:bCs/>
+          <w:color w:val="1F3864"/>
+          <w:sz w:val="28"/>
+          <w:szCs w:val="28"/>
+        </w:rPr>
+        <w:t xml:space="preserve">6. Dificultades encontradas</w:t>
       </w:r>
     </w:p>
     <w:p>
@@ -1791,7 +2265,7 @@
           <w:sz w:val="22"/>
           <w:szCs w:val="22"/>
         </w:rPr>
-        <w:t xml:space="preserve">Decidí no subir la carpeta que contiene los archivos .sql. La importación se hace desde phpMyAdmin seleccionando el archivo que está en mi propia computadora, así que subirlos al servidor no aporta nada y, en cambio, dejaría el volcado completo de la base al alcance de cualquiera que adivinara la dirección.</w:t>
+        <w:t xml:space="preserve">Esta fue la parte más instructiva del trabajo. Ninguno de los problemas apareció mientras programaba; todos surgieron al enfrentar el entorno real, que se comporta distinto del entorno local.</w:t>
       </w:r>
     </w:p>
     <w:p>
@@ -1808,7 +2282,7 @@
           <w:sz w:val="24"/>
           <w:szCs w:val="24"/>
         </w:rPr>
-        <w:t xml:space="preserve">5.4 Creación de la base de datos</w:t>
+        <w:t xml:space="preserve">6.1 El gestor de archivos rechazó el archivo comprimido</w:t>
       </w:r>
     </w:p>
     <w:p>
@@ -1822,42 +2296,53 @@
           <w:sz w:val="22"/>
           <w:szCs w:val="22"/>
         </w:rPr>
-        <w:t xml:space="preserve">Desde la sección de bases de datos del panel creé una base nueva. Aquí apareció el primer detalle propio del alojamiento compartido: el panel antepone el identificador de la cuenta al nombre que uno elige, de modo que la base que llamé "dyd" quedó registrada con el prefijo correspondiente. Lo mismo ocurre con el usuario.</w:t>
-      </w:r>
-    </w:p>
-    <w:p>
-      <w:pPr>
-        <w:pBdr>
-          <w:top w:val="dashed" w:color="9E9E9E" w:sz="6"/>
-          <w:bottom w:val="dashed" w:color="9E9E9E" w:sz="6"/>
-          <w:left w:val="dashed" w:color="9E9E9E" w:sz="6"/>
-          <w:right w:val="dashed" w:color="9E9E9E" w:sz="6"/>
-        </w:pBdr>
-        <w:shd w:fill="F2F2F2" w:val="clear"/>
-        <w:spacing w:after="200" w:before="140"/>
+        <w:t xml:space="preserve">Comprimí el proyecto en formato RAR y el gestor devolvió un mensaje indicando que no podía abrir el archivo porque no era un ZIP. El servicio acepta únicamente ZIP para la carga con extracción automática. Rehice la compresión en ese formato desde el propio explorador de Windows y el problema desapareció.</w:t>
+      </w:r>
+    </w:p>
+    <w:p>
+      <w:pPr>
+        <w:spacing w:after="80" w:before="140"/>
         <w:jc w:val="center"/>
       </w:pPr>
       <w:r>
-        <w:rPr>
-          <w:rFonts w:ascii="Arial" w:cs="Arial" w:eastAsia="Arial" w:hAnsi="Arial"/>
-          <w:b/>
-          <w:bCs/>
-          <w:color w:val="7F7F7F"/>
-          <w:sz w:val="20"/>
-          <w:szCs w:val="20"/>
-        </w:rPr>
-        <w:t xml:space="preserve">[ INSERTAR CAPTURA 3 ]</w:t>
-      </w:r>
-      <w:r>
-        <w:rPr>
-          <w:rFonts w:ascii="Arial" w:cs="Arial" w:eastAsia="Arial" w:hAnsi="Arial"/>
-          <w:i/>
-          <w:iCs/>
-          <w:color w:val="7F7F7F"/>
-          <w:sz w:val="20"/>
-          <w:szCs w:val="20"/>
-        </w:rPr>
-        <w:t xml:space="preserve">  Sección de bases de datos MySQL con los datos de conexión y la base creada.</w:t>
+        <w:drawing>
+          <wp:inline distT="0" distB="0" distL="0" distR="0">
+            <wp:extent cx="4000500" cy="4038600"/>
+            <wp:effectExtent t="0" r="0" b="0" l="0"/>
+            <wp:docPr id="1" name="" descr="" title=""/>
+            <wp:cNvGraphicFramePr>
+              <a:graphicFrameLocks xmlns:a="http://schemas.openxmlformats.org/drawingml/2006/main" noChangeAspect="1"/>
+            </wp:cNvGraphicFramePr>
+            <a:graphic xmlns:a="http://schemas.openxmlformats.org/drawingml/2006/main">
+              <a:graphicData uri="http://schemas.openxmlformats.org/drawingml/2006/picture">
+                <pic:pic xmlns:pic="http://schemas.openxmlformats.org/drawingml/2006/picture">
+                  <pic:nvPicPr>
+                    <pic:cNvPr id="0" name="" descr=""/>
+                    <pic:cNvPicPr>
+                      <a:picLocks noChangeAspect="1" noChangeArrowheads="1"/>
+                    </pic:cNvPicPr>
+                  </pic:nvPicPr>
+                  <pic:blipFill>
+                    <a:blip r:embed="rId10" cstate="none"/>
+                    <a:srcRect/>
+                    <a:stretch>
+                      <a:fillRect/>
+                    </a:stretch>
+                  </pic:blipFill>
+                  <pic:spPr bwMode="auto">
+                    <a:xfrm>
+                      <a:off x="0" y="0"/>
+                      <a:ext cx="4000500" cy="4038600"/>
+                    </a:xfrm>
+                    <a:prstGeom prst="rect">
+                      <a:avLst/>
+                    </a:prstGeom>
+                  </pic:spPr>
+                </pic:pic>
+              </a:graphicData>
+            </a:graphic>
+          </wp:inline>
+        </w:drawing>
       </w:r>
     </w:p>
     <w:p>
@@ -1873,21 +2358,7 @@
           <w:sz w:val="18"/>
           <w:szCs w:val="18"/>
         </w:rPr>
-        <w:t xml:space="preserve">Figura 5. Datos de conexión entregados por el panel.</w:t>
-      </w:r>
-    </w:p>
-    <w:p>
-      <w:pPr>
-        <w:spacing w:after="160" w:line="300"/>
-        <w:jc w:val="both"/>
-      </w:pPr>
-      <w:r>
-        <w:rPr>
-          <w:rFonts w:ascii="Arial" w:cs="Arial" w:eastAsia="Arial" w:hAnsi="Arial"/>
-          <w:sz w:val="22"/>
-          <w:szCs w:val="22"/>
-        </w:rPr>
-        <w:t xml:space="preserve">El panel muestra cuatro datos que hay que copiar tal como aparecen: nombre del servidor MySQL, nombre de la base, usuario y contraseña. Anotarlos con exactitud evita la mayor parte de los errores posteriores.</w:t>
+        <w:t xml:space="preserve">Figura 8. Mensaje de error al intentar subir el proyecto comprimido en RAR.</w:t>
       </w:r>
     </w:p>
     <w:p>
@@ -1904,7 +2375,7 @@
           <w:sz w:val="24"/>
           <w:szCs w:val="24"/>
         </w:rPr>
-        <w:t xml:space="preserve">5.5 Importación de la estructura y los datos</w:t>
+        <w:t xml:space="preserve">6.2 Creación de carpetas fuera de htdocs</w:t>
       </w:r>
     </w:p>
     <w:p>
@@ -1918,42 +2389,53 @@
           <w:sz w:val="22"/>
           <w:szCs w:val="22"/>
         </w:rPr>
-        <w:t xml:space="preserve">Abrí phpMyAdmin desde el panel, seleccioné la base recién creada y utilicé la pestaña de importación, primero con el archivo de estructura y luego con el de contenido. El orden importa: el segundo archivo inserta registros en tablas que solo existen después de ejecutar el primero.</w:t>
-      </w:r>
-    </w:p>
-    <w:p>
-      <w:pPr>
-        <w:pBdr>
-          <w:top w:val="dashed" w:color="9E9E9E" w:sz="6"/>
-          <w:bottom w:val="dashed" w:color="9E9E9E" w:sz="6"/>
-          <w:left w:val="dashed" w:color="9E9E9E" w:sz="6"/>
-          <w:right w:val="dashed" w:color="9E9E9E" w:sz="6"/>
-        </w:pBdr>
-        <w:shd w:fill="F2F2F2" w:val="clear"/>
-        <w:spacing w:after="200" w:before="140"/>
+        <w:t xml:space="preserve">Al intentar subir el proyecto obtuve un aviso que decía que la creación de directorios solo está permitida dentro de las carpetas htdocs por motivos de seguridad. El error se explicaba solo: yo estaba parado en la raíz de la cuenta y no dentro de la carpeta pública. Entrando primero a htdocs, la carga se completó sin inconvenientes.</w:t>
+      </w:r>
+    </w:p>
+    <w:p>
+      <w:pPr>
+        <w:spacing w:after="80" w:before="140"/>
         <w:jc w:val="center"/>
       </w:pPr>
       <w:r>
-        <w:rPr>
-          <w:rFonts w:ascii="Arial" w:cs="Arial" w:eastAsia="Arial" w:hAnsi="Arial"/>
-          <w:b/>
-          <w:bCs/>
-          <w:color w:val="7F7F7F"/>
-          <w:sz w:val="20"/>
-          <w:szCs w:val="20"/>
-        </w:rPr>
-        <w:t xml:space="preserve">[ INSERTAR CAPTURA 4 ]</w:t>
-      </w:r>
-      <w:r>
-        <w:rPr>
-          <w:rFonts w:ascii="Arial" w:cs="Arial" w:eastAsia="Arial" w:hAnsi="Arial"/>
-          <w:i/>
-          <w:iCs/>
-          <w:color w:val="7F7F7F"/>
-          <w:sz w:val="20"/>
-          <w:szCs w:val="20"/>
-        </w:rPr>
-        <w:t xml:space="preserve">  phpMyAdmin con las tablas del proyecto ya creadas tras la importación.</w:t>
+        <w:drawing>
+          <wp:inline distT="0" distB="0" distL="0" distR="0">
+            <wp:extent cx="4191000" cy="3800475"/>
+            <wp:effectExtent t="0" r="0" b="0" l="0"/>
+            <wp:docPr id="1" name="" descr="" title=""/>
+            <wp:cNvGraphicFramePr>
+              <a:graphicFrameLocks xmlns:a="http://schemas.openxmlformats.org/drawingml/2006/main" noChangeAspect="1"/>
+            </wp:cNvGraphicFramePr>
+            <a:graphic xmlns:a="http://schemas.openxmlformats.org/drawingml/2006/main">
+              <a:graphicData uri="http://schemas.openxmlformats.org/drawingml/2006/picture">
+                <pic:pic xmlns:pic="http://schemas.openxmlformats.org/drawingml/2006/picture">
+                  <pic:nvPicPr>
+                    <pic:cNvPr id="0" name="" descr=""/>
+                    <pic:cNvPicPr>
+                      <a:picLocks noChangeAspect="1" noChangeArrowheads="1"/>
+                    </pic:cNvPicPr>
+                  </pic:nvPicPr>
+                  <pic:blipFill>
+                    <a:blip r:embed="rId11" cstate="none"/>
+                    <a:srcRect/>
+                    <a:stretch>
+                      <a:fillRect/>
+                    </a:stretch>
+                  </pic:blipFill>
+                  <pic:spPr bwMode="auto">
+                    <a:xfrm>
+                      <a:off x="0" y="0"/>
+                      <a:ext cx="4191000" cy="3800475"/>
+                    </a:xfrm>
+                    <a:prstGeom prst="rect">
+                      <a:avLst/>
+                    </a:prstGeom>
+                  </pic:spPr>
+                </pic:pic>
+              </a:graphicData>
+            </a:graphic>
+          </wp:inline>
+        </w:drawing>
       </w:r>
     </w:p>
     <w:p>
@@ -1969,7 +2451,7 @@
           <w:sz w:val="18"/>
           <w:szCs w:val="18"/>
         </w:rPr>
-        <w:t xml:space="preserve">Figura 6. Base de datos migrada correctamente.</w:t>
+        <w:t xml:space="preserve">Figura 9. Aviso del gestor de archivos al intentar cargar fuera de htdocs.</w:t>
       </w:r>
     </w:p>
     <w:p>
@@ -1986,7 +2468,7 @@
           <w:sz w:val="24"/>
           <w:szCs w:val="24"/>
         </w:rPr>
-        <w:t xml:space="preserve">5.6 Configuración de la conexión</w:t>
+        <w:t xml:space="preserve">6.3 Sentencias DROP DATABASE desactivadas</w:t>
       </w:r>
     </w:p>
     <w:p>
@@ -2000,192 +2482,53 @@
           <w:sz w:val="22"/>
           <w:szCs w:val="22"/>
         </w:rPr>
-        <w:t xml:space="preserve">Con la base ya cargada, faltaba indicarle a la aplicación dónde encontrarla. Creé en el servidor un archivo de configuración con los cuatro datos del panel, siguiendo esta estructura:</w:t>
-      </w:r>
-    </w:p>
-    <w:p>
-      <w:pPr>
-        <w:shd w:fill="F5F5F5" w:val="clear"/>
-        <w:spacing w:after="0" w:line="260"/>
-        <w:ind w:left="431"/>
-      </w:pPr>
-      <w:r>
-        <w:rPr>
-          <w:rFonts w:ascii="Consolas" w:cs="Consolas" w:eastAsia="Consolas" w:hAnsi="Consolas"/>
-          <w:sz w:val="19"/>
-          <w:szCs w:val="19"/>
-        </w:rPr>
-        <w:t xml:space="preserve">&lt;?php</w:t>
-      </w:r>
-    </w:p>
-    <w:p>
-      <w:pPr>
-        <w:shd w:fill="F5F5F5" w:val="clear"/>
-        <w:spacing w:after="0" w:line="260"/>
-        <w:ind w:left="431"/>
-      </w:pPr>
-      <w:r>
-        <w:rPr>
-          <w:rFonts w:ascii="Consolas" w:cs="Consolas" w:eastAsia="Consolas" w:hAnsi="Consolas"/>
-          <w:sz w:val="19"/>
-          <w:szCs w:val="19"/>
-        </w:rPr>
-        <w:t xml:space="preserve">return [</w:t>
-      </w:r>
-    </w:p>
-    <w:p>
-      <w:pPr>
-        <w:shd w:fill="F5F5F5" w:val="clear"/>
-        <w:spacing w:after="0" w:line="260"/>
-        <w:ind w:left="431"/>
-      </w:pPr>
-      <w:r>
-        <w:rPr>
-          <w:rFonts w:ascii="Consolas" w:cs="Consolas" w:eastAsia="Consolas" w:hAnsi="Consolas"/>
-          <w:sz w:val="19"/>
-          <w:szCs w:val="19"/>
-        </w:rPr>
-        <w:t xml:space="preserve">    'host'    =&gt; 'sqlXXX.infinityfree.com',</w:t>
-      </w:r>
-    </w:p>
-    <w:p>
-      <w:pPr>
-        <w:shd w:fill="F5F5F5" w:val="clear"/>
-        <w:spacing w:after="0" w:line="260"/>
-        <w:ind w:left="431"/>
-      </w:pPr>
-      <w:r>
-        <w:rPr>
-          <w:rFonts w:ascii="Consolas" w:cs="Consolas" w:eastAsia="Consolas" w:hAnsi="Consolas"/>
-          <w:sz w:val="19"/>
-          <w:szCs w:val="19"/>
-        </w:rPr>
-        <w:t xml:space="preserve">    'base'    =&gt; 'ifX_XXXXXXXX_dyd',</w:t>
-      </w:r>
-    </w:p>
-    <w:p>
-      <w:pPr>
-        <w:shd w:fill="F5F5F5" w:val="clear"/>
-        <w:spacing w:after="0" w:line="260"/>
-        <w:ind w:left="431"/>
-      </w:pPr>
-      <w:r>
-        <w:rPr>
-          <w:rFonts w:ascii="Consolas" w:cs="Consolas" w:eastAsia="Consolas" w:hAnsi="Consolas"/>
-          <w:sz w:val="19"/>
-          <w:szCs w:val="19"/>
-        </w:rPr>
-        <w:t xml:space="preserve">    'usuario' =&gt; 'ifX_XXXXXXXX',</w:t>
-      </w:r>
-    </w:p>
-    <w:p>
-      <w:pPr>
-        <w:shd w:fill="F5F5F5" w:val="clear"/>
-        <w:spacing w:after="0" w:line="260"/>
-        <w:ind w:left="431"/>
-      </w:pPr>
-      <w:r>
-        <w:rPr>
-          <w:rFonts w:ascii="Consolas" w:cs="Consolas" w:eastAsia="Consolas" w:hAnsi="Consolas"/>
-          <w:sz w:val="19"/>
-          <w:szCs w:val="19"/>
-        </w:rPr>
-        <w:t xml:space="preserve">    'clave'   =&gt; '**********',</w:t>
-      </w:r>
-    </w:p>
-    <w:p>
-      <w:pPr>
-        <w:shd w:fill="F5F5F5" w:val="clear"/>
-        <w:spacing w:after="200" w:line="260"/>
-        <w:ind w:left="431"/>
-      </w:pPr>
-      <w:r>
-        <w:rPr>
-          <w:rFonts w:ascii="Consolas" w:cs="Consolas" w:eastAsia="Consolas" w:hAnsi="Consolas"/>
-          <w:sz w:val="19"/>
-          <w:szCs w:val="19"/>
-        </w:rPr>
-        <w:t xml:space="preserve">];</w:t>
-      </w:r>
-    </w:p>
-    <w:p>
-      <w:pPr>
-        <w:spacing w:after="160" w:line="300"/>
-        <w:jc w:val="both"/>
-      </w:pPr>
-      <w:r>
-        <w:rPr>
-          <w:rFonts w:ascii="Arial" w:cs="Arial" w:eastAsia="Arial" w:hAnsi="Arial"/>
-          <w:sz w:val="22"/>
-          <w:szCs w:val="22"/>
-        </w:rPr>
-        <w:t xml:space="preserve">Este archivo vive únicamente en el servidor y está excluido del repositorio, por las razones que detallo en el apartado de buenas prácticas.</w:t>
-      </w:r>
-    </w:p>
-    <w:p>
-      <w:pPr>
-        <w:pStyle w:val="Heading2"/>
-        <w:spacing w:after="140" w:before="240"/>
-      </w:pPr>
-      <w:r>
-        <w:rPr>
-          <w:rFonts w:ascii="Arial" w:cs="Arial" w:eastAsia="Arial" w:hAnsi="Arial"/>
-          <w:b/>
-          <w:bCs/>
-          <w:color w:val="2E5496"/>
-          <w:sz w:val="24"/>
-          <w:szCs w:val="24"/>
-        </w:rPr>
-        <w:t xml:space="preserve">5.7 Verificación</w:t>
-      </w:r>
-    </w:p>
-    <w:p>
-      <w:pPr>
-        <w:spacing w:after="160" w:line="300"/>
-        <w:jc w:val="both"/>
-      </w:pPr>
-      <w:r>
-        <w:rPr>
-          <w:rFonts w:ascii="Arial" w:cs="Arial" w:eastAsia="Arial" w:hAnsi="Arial"/>
-          <w:sz w:val="22"/>
-          <w:szCs w:val="22"/>
-        </w:rPr>
-        <w:t xml:space="preserve">Con todo en su lugar abrí la dirección pública y comprobé el funcionamiento completo: la portada cargando los reportajes desde la base, la navegación entre secciones, el acceso al panel de administración y las operaciones de crear, editar y eliminar. Presté atención especial a que las tildes y las eñes se guardaran y se mostraran correctamente, porque la codificación de caracteres es uno de los puntos donde suelen aparecer fallas al cambiar de servidor.</w:t>
-      </w:r>
-    </w:p>
-    <w:p>
-      <w:pPr>
-        <w:pBdr>
-          <w:top w:val="dashed" w:color="9E9E9E" w:sz="6"/>
-          <w:bottom w:val="dashed" w:color="9E9E9E" w:sz="6"/>
-          <w:left w:val="dashed" w:color="9E9E9E" w:sz="6"/>
-          <w:right w:val="dashed" w:color="9E9E9E" w:sz="6"/>
-        </w:pBdr>
-        <w:shd w:fill="F2F2F2" w:val="clear"/>
-        <w:spacing w:after="200" w:before="140"/>
+        <w:t xml:space="preserve">Al importar el archivo de estructura, phpMyAdmin interrumpió la operación con el mensaje de que las sentencias DROP DATABASE están desactivadas. Investigando comprendí la causa: mi archivo venía preparado para XAMPP, donde el usuario root puede borrar y crear bases libremente. En un alojamiento compartido eso no se permite, porque el servidor es compartido con cientos de cuentas y la base ya viene creada desde el panel con un nombre asignado.</w:t>
+      </w:r>
+    </w:p>
+    <w:p>
+      <w:pPr>
+        <w:spacing w:after="80" w:before="140"/>
         <w:jc w:val="center"/>
       </w:pPr>
       <w:r>
-        <w:rPr>
-          <w:rFonts w:ascii="Arial" w:cs="Arial" w:eastAsia="Arial" w:hAnsi="Arial"/>
-          <w:b/>
-          <w:bCs/>
-          <w:color w:val="7F7F7F"/>
-          <w:sz w:val="20"/>
-          <w:szCs w:val="20"/>
-        </w:rPr>
-        <w:t xml:space="preserve">[ INSERTAR CAPTURA 5 ]</w:t>
-      </w:r>
-      <w:r>
-        <w:rPr>
-          <w:rFonts w:ascii="Arial" w:cs="Arial" w:eastAsia="Arial" w:hAnsi="Arial"/>
-          <w:i/>
-          <w:iCs/>
-          <w:color w:val="7F7F7F"/>
-          <w:sz w:val="20"/>
-          <w:szCs w:val="20"/>
-        </w:rPr>
-        <w:t xml:space="preserve">  Sitio funcionando en la dirección pública.</w:t>
+        <w:drawing>
+          <wp:inline distT="0" distB="0" distL="0" distR="0">
+            <wp:extent cx="5334000" cy="3314700"/>
+            <wp:effectExtent t="0" r="0" b="0" l="0"/>
+            <wp:docPr id="1" name="" descr="" title=""/>
+            <wp:cNvGraphicFramePr>
+              <a:graphicFrameLocks xmlns:a="http://schemas.openxmlformats.org/drawingml/2006/main" noChangeAspect="1"/>
+            </wp:cNvGraphicFramePr>
+            <a:graphic xmlns:a="http://schemas.openxmlformats.org/drawingml/2006/main">
+              <a:graphicData uri="http://schemas.openxmlformats.org/drawingml/2006/picture">
+                <pic:pic xmlns:pic="http://schemas.openxmlformats.org/drawingml/2006/picture">
+                  <pic:nvPicPr>
+                    <pic:cNvPr id="0" name="" descr=""/>
+                    <pic:cNvPicPr>
+                      <a:picLocks noChangeAspect="1" noChangeArrowheads="1"/>
+                    </pic:cNvPicPr>
+                  </pic:nvPicPr>
+                  <pic:blipFill>
+                    <a:blip r:embed="rId12" cstate="none"/>
+                    <a:srcRect/>
+                    <a:stretch>
+                      <a:fillRect/>
+                    </a:stretch>
+                  </pic:blipFill>
+                  <pic:spPr bwMode="auto">
+                    <a:xfrm>
+                      <a:off x="0" y="0"/>
+                      <a:ext cx="5334000" cy="3314700"/>
+                    </a:xfrm>
+                    <a:prstGeom prst="rect">
+                      <a:avLst/>
+                    </a:prstGeom>
+                  </pic:spPr>
+                </pic:pic>
+              </a:graphicData>
+            </a:graphic>
+          </wp:inline>
+        </w:drawing>
       </w:r>
     </w:p>
     <w:p>
@@ -2201,131 +2544,7 @@
           <w:sz w:val="18"/>
           <w:szCs w:val="18"/>
         </w:rPr>
-        <w:t xml:space="preserve">Figura 7. Aplicación publicada y operativa.</w:t>
-      </w:r>
-    </w:p>
-    <w:p>
-      <w:pPr>
-        <w:pStyle w:val="Heading1"/>
-        <w:spacing w:after="180" w:before="320"/>
-      </w:pPr>
-      <w:r>
-        <w:rPr>
-          <w:rFonts w:ascii="Arial" w:cs="Arial" w:eastAsia="Arial" w:hAnsi="Arial"/>
-          <w:b/>
-          <w:bCs/>
-          <w:color w:val="1F3864"/>
-          <w:sz w:val="28"/>
-          <w:szCs w:val="28"/>
-        </w:rPr>
-        <w:t xml:space="preserve">6. Dificultades encontradas</w:t>
-      </w:r>
-    </w:p>
-    <w:p>
-      <w:pPr>
-        <w:spacing w:after="160" w:line="300"/>
-        <w:jc w:val="both"/>
-      </w:pPr>
-      <w:r>
-        <w:rPr>
-          <w:rFonts w:ascii="Arial" w:cs="Arial" w:eastAsia="Arial" w:hAnsi="Arial"/>
-          <w:sz w:val="22"/>
-          <w:szCs w:val="22"/>
-        </w:rPr>
-        <w:t xml:space="preserve">Esta fue la parte más instructiva del trabajo. Ninguno de los problemas apareció mientras programaba; todos surgieron al enfrentar el entorno real, que se comporta distinto del entorno local.</w:t>
-      </w:r>
-    </w:p>
-    <w:p>
-      <w:pPr>
-        <w:pStyle w:val="Heading2"/>
-        <w:spacing w:after="140" w:before="240"/>
-      </w:pPr>
-      <w:r>
-        <w:rPr>
-          <w:rFonts w:ascii="Arial" w:cs="Arial" w:eastAsia="Arial" w:hAnsi="Arial"/>
-          <w:b/>
-          <w:bCs/>
-          <w:color w:val="2E5496"/>
-          <w:sz w:val="24"/>
-          <w:szCs w:val="24"/>
-        </w:rPr>
-        <w:t xml:space="preserve">6.1 El gestor de archivos rechazó el archivo comprimido</w:t>
-      </w:r>
-    </w:p>
-    <w:p>
-      <w:pPr>
-        <w:spacing w:after="160" w:line="300"/>
-        <w:jc w:val="both"/>
-      </w:pPr>
-      <w:r>
-        <w:rPr>
-          <w:rFonts w:ascii="Arial" w:cs="Arial" w:eastAsia="Arial" w:hAnsi="Arial"/>
-          <w:sz w:val="22"/>
-          <w:szCs w:val="22"/>
-        </w:rPr>
-        <w:t xml:space="preserve">Comprimí el proyecto en formato RAR y el gestor devolvió un mensaje indicando que no podía abrir el archivo porque no era un ZIP. El servicio acepta únicamente ZIP para la carga con extracción automática. Rehice la compresión en ese formato desde el propio explorador de Windows y el problema desapareció.</w:t>
-      </w:r>
-    </w:p>
-    <w:p>
-      <w:pPr>
-        <w:pStyle w:val="Heading2"/>
-        <w:spacing w:after="140" w:before="240"/>
-      </w:pPr>
-      <w:r>
-        <w:rPr>
-          <w:rFonts w:ascii="Arial" w:cs="Arial" w:eastAsia="Arial" w:hAnsi="Arial"/>
-          <w:b/>
-          <w:bCs/>
-          <w:color w:val="2E5496"/>
-          <w:sz w:val="24"/>
-          <w:szCs w:val="24"/>
-        </w:rPr>
-        <w:t xml:space="preserve">6.2 Creación de carpetas fuera de htdocs</w:t>
-      </w:r>
-    </w:p>
-    <w:p>
-      <w:pPr>
-        <w:spacing w:after="160" w:line="300"/>
-        <w:jc w:val="both"/>
-      </w:pPr>
-      <w:r>
-        <w:rPr>
-          <w:rFonts w:ascii="Arial" w:cs="Arial" w:eastAsia="Arial" w:hAnsi="Arial"/>
-          <w:sz w:val="22"/>
-          <w:szCs w:val="22"/>
-        </w:rPr>
-        <w:t xml:space="preserve">Al intentar subir el proyecto obtuve un aviso que decía que la creación de directorios solo está permitida dentro de las carpetas htdocs por motivos de seguridad. El error se explicaba solo: yo estaba parado en la raíz de la cuenta y no dentro de la carpeta pública. Entrando primero a htdocs, la carga se completó sin inconvenientes.</w:t>
-      </w:r>
-    </w:p>
-    <w:p>
-      <w:pPr>
-        <w:pStyle w:val="Heading2"/>
-        <w:spacing w:after="140" w:before="240"/>
-      </w:pPr>
-      <w:r>
-        <w:rPr>
-          <w:rFonts w:ascii="Arial" w:cs="Arial" w:eastAsia="Arial" w:hAnsi="Arial"/>
-          <w:b/>
-          <w:bCs/>
-          <w:color w:val="2E5496"/>
-          <w:sz w:val="24"/>
-          <w:szCs w:val="24"/>
-        </w:rPr>
-        <w:t xml:space="preserve">6.3 Sentencias DROP DATABASE desactivadas</w:t>
-      </w:r>
-    </w:p>
-    <w:p>
-      <w:pPr>
-        <w:spacing w:after="160" w:line="300"/>
-        <w:jc w:val="both"/>
-      </w:pPr>
-      <w:r>
-        <w:rPr>
-          <w:rFonts w:ascii="Arial" w:cs="Arial" w:eastAsia="Arial" w:hAnsi="Arial"/>
-          <w:sz w:val="22"/>
-          <w:szCs w:val="22"/>
-        </w:rPr>
-        <w:t xml:space="preserve">Al importar el archivo de estructura, phpMyAdmin interrumpió la operación con el mensaje de que las sentencias DROP DATABASE están desactivadas. Investigando comprendí la causa: mi archivo venía preparado para XAMPP, donde el usuario root puede borrar y crear bases libremente. En un alojamiento compartido eso no se permite, porque el servidor es compartido con cientos de cuentas y la base ya viene creada desde el panel con un nombre asignado.</w:t>
+        <w:t xml:space="preserve">Figura 10. phpMyAdmin rechazando la sentencia DROP DATABASE.</w:t>
       </w:r>
     </w:p>
     <w:p>
@@ -3034,7 +3253,7 @@
           <w:sz w:val="18"/>
           <w:szCs w:val="18"/>
         </w:rPr>
-        <w:t xml:space="preserve">Figura 8. Síntesis de los problemas y sus soluciones.</w:t>
+        <w:t xml:space="preserve">Figura 11. Síntesis de los problemas y sus soluciones.</w:t>
       </w:r>
     </w:p>
     <w:p>

</xml_diff>